<commit_message>
Se agregan documentos grupales fase 2
</commit_message>
<xml_diff>
--- a/Fase 1/Ingenieria/Documento_Vision_Producto_SkateClub.docx
+++ b/Fase 1/Ingenieria/Documento_Vision_Producto_SkateClub.docx
@@ -988,23 +988,7 @@
                 <w:sz w:val="20"/>
                 <w:szCs w:val="20"/>
               </w:rPr>
-              <w:t xml:space="preserve">Primer borrador de público objetivo, MVP y </w:t>
-            </w:r>
-            <w:proofErr w:type="spellStart"/>
-            <w:r>
-              <w:rPr>
-                <w:sz w:val="20"/>
-                <w:szCs w:val="20"/>
-              </w:rPr>
-              <w:t>stack</w:t>
-            </w:r>
-            <w:proofErr w:type="spellEnd"/>
-            <w:r>
-              <w:rPr>
-                <w:sz w:val="20"/>
-                <w:szCs w:val="20"/>
-              </w:rPr>
-              <w:t xml:space="preserve"> tecnológico, según asesoría de la Semana 2.</w:t>
+              <w:t>Primer borrador de público objetivo, MVP y stack tecnológico, según asesoría de la Semana 2.</w:t>
             </w:r>
           </w:p>
         </w:tc>
@@ -1091,23 +1075,7 @@
                 <w:sz w:val="20"/>
                 <w:szCs w:val="20"/>
               </w:rPr>
-              <w:t xml:space="preserve">Incorporación de retroalimentación docente: objetivos, </w:t>
-            </w:r>
-            <w:proofErr w:type="spellStart"/>
-            <w:r>
-              <w:rPr>
-                <w:sz w:val="20"/>
-                <w:szCs w:val="20"/>
-              </w:rPr>
-              <w:t>KPIs</w:t>
-            </w:r>
-            <w:proofErr w:type="spellEnd"/>
-            <w:r>
-              <w:rPr>
-                <w:sz w:val="20"/>
-                <w:szCs w:val="20"/>
-              </w:rPr>
-              <w:t>, restricciones y modelo de negocio (Semana 3).</w:t>
+              <w:t>Incorporación de retroalimentación docente: objetivos, KPIs, restricciones y modelo de negocio (Semana 3).</w:t>
             </w:r>
           </w:p>
         </w:tc>
@@ -1279,55 +1247,7 @@
                 <w:sz w:val="20"/>
                 <w:szCs w:val="20"/>
               </w:rPr>
-              <w:t xml:space="preserve">Corrección técnica </w:t>
-            </w:r>
-            <w:proofErr w:type="spellStart"/>
-            <w:r>
-              <w:rPr>
-                <w:sz w:val="20"/>
-                <w:szCs w:val="20"/>
-              </w:rPr>
-              <w:t>post-revisión</w:t>
-            </w:r>
-            <w:proofErr w:type="spellEnd"/>
-            <w:r>
-              <w:rPr>
-                <w:sz w:val="20"/>
-                <w:szCs w:val="20"/>
-              </w:rPr>
-              <w:t xml:space="preserve"> de par: arquitectura real (cliente-servidor, no microservicios), despliegue (</w:t>
-            </w:r>
-            <w:proofErr w:type="spellStart"/>
-            <w:r>
-              <w:rPr>
-                <w:sz w:val="20"/>
-                <w:szCs w:val="20"/>
-              </w:rPr>
-              <w:t>Vercel</w:t>
-            </w:r>
-            <w:proofErr w:type="spellEnd"/>
-            <w:r>
-              <w:rPr>
-                <w:sz w:val="20"/>
-                <w:szCs w:val="20"/>
-              </w:rPr>
-              <w:t xml:space="preserve"> como producción, Render como alternativa), alcance del producto en tres niveles, metodología alineada a Jira y </w:t>
-            </w:r>
-            <w:proofErr w:type="spellStart"/>
-            <w:r>
-              <w:rPr>
-                <w:sz w:val="20"/>
-                <w:szCs w:val="20"/>
-              </w:rPr>
-              <w:t>KPIs</w:t>
-            </w:r>
-            <w:proofErr w:type="spellEnd"/>
-            <w:r>
-              <w:rPr>
-                <w:sz w:val="20"/>
-                <w:szCs w:val="20"/>
-              </w:rPr>
-              <w:t xml:space="preserve"> con método de medición (Semana 7).</w:t>
+              <w:t>Corrección técnica post-revisión de par: arquitectura real (cliente-servidor, no microservicios), despliegue (Vercel como producción, Render como alternativa), alcance del producto en tres niveles, metodología alineada a Jira y KPIs con método de medición (Semana 7).</w:t>
             </w:r>
           </w:p>
         </w:tc>
@@ -1547,7 +1467,7 @@
               <w:rPr>
                 <w:noProof/>
               </w:rPr>
-              <w:t>1</w:t>
+              <w:t>3</w:t>
             </w:r>
             <w:r>
               <w:rPr>
@@ -1610,7 +1530,7 @@
               <w:rPr>
                 <w:noProof/>
               </w:rPr>
-              <w:t>1</w:t>
+              <w:t>4</w:t>
             </w:r>
             <w:r>
               <w:rPr>
@@ -1673,7 +1593,7 @@
               <w:rPr>
                 <w:noProof/>
               </w:rPr>
-              <w:t>1</w:t>
+              <w:t>4</w:t>
             </w:r>
             <w:r>
               <w:rPr>
@@ -1736,7 +1656,7 @@
               <w:rPr>
                 <w:noProof/>
               </w:rPr>
-              <w:t>1</w:t>
+              <w:t>5</w:t>
             </w:r>
             <w:r>
               <w:rPr>
@@ -1799,7 +1719,7 @@
               <w:rPr>
                 <w:noProof/>
               </w:rPr>
-              <w:t>1</w:t>
+              <w:t>5</w:t>
             </w:r>
             <w:r>
               <w:rPr>
@@ -1862,7 +1782,7 @@
               <w:rPr>
                 <w:noProof/>
               </w:rPr>
-              <w:t>1</w:t>
+              <w:t>5</w:t>
             </w:r>
             <w:r>
               <w:rPr>
@@ -1925,7 +1845,7 @@
               <w:rPr>
                 <w:noProof/>
               </w:rPr>
-              <w:t>1</w:t>
+              <w:t>5</w:t>
             </w:r>
             <w:r>
               <w:rPr>
@@ -1988,7 +1908,7 @@
               <w:rPr>
                 <w:noProof/>
               </w:rPr>
-              <w:t>1</w:t>
+              <w:t>6</w:t>
             </w:r>
             <w:r>
               <w:rPr>
@@ -2051,7 +1971,7 @@
               <w:rPr>
                 <w:noProof/>
               </w:rPr>
-              <w:t>1</w:t>
+              <w:t>6</w:t>
             </w:r>
             <w:r>
               <w:rPr>
@@ -2114,7 +2034,7 @@
               <w:rPr>
                 <w:noProof/>
               </w:rPr>
-              <w:t>1</w:t>
+              <w:t>6</w:t>
             </w:r>
             <w:r>
               <w:rPr>
@@ -2177,7 +2097,7 @@
               <w:rPr>
                 <w:noProof/>
               </w:rPr>
-              <w:t>1</w:t>
+              <w:t>6</w:t>
             </w:r>
             <w:r>
               <w:rPr>
@@ -2240,7 +2160,7 @@
               <w:rPr>
                 <w:noProof/>
               </w:rPr>
-              <w:t>1</w:t>
+              <w:t>7</w:t>
             </w:r>
             <w:r>
               <w:rPr>
@@ -2303,7 +2223,7 @@
               <w:rPr>
                 <w:noProof/>
               </w:rPr>
-              <w:t>1</w:t>
+              <w:t>7</w:t>
             </w:r>
             <w:r>
               <w:rPr>
@@ -2366,7 +2286,7 @@
               <w:rPr>
                 <w:noProof/>
               </w:rPr>
-              <w:t>1</w:t>
+              <w:t>7</w:t>
             </w:r>
             <w:r>
               <w:rPr>
@@ -2429,7 +2349,7 @@
               <w:rPr>
                 <w:noProof/>
               </w:rPr>
-              <w:t>1</w:t>
+              <w:t>7</w:t>
             </w:r>
             <w:r>
               <w:rPr>
@@ -2492,7 +2412,7 @@
               <w:rPr>
                 <w:noProof/>
               </w:rPr>
-              <w:t>1</w:t>
+              <w:t>7</w:t>
             </w:r>
             <w:r>
               <w:rPr>
@@ -2555,7 +2475,7 @@
               <w:rPr>
                 <w:noProof/>
               </w:rPr>
-              <w:t>1</w:t>
+              <w:t>8</w:t>
             </w:r>
             <w:r>
               <w:rPr>
@@ -2618,7 +2538,7 @@
               <w:rPr>
                 <w:noProof/>
               </w:rPr>
-              <w:t>1</w:t>
+              <w:t>8</w:t>
             </w:r>
             <w:r>
               <w:rPr>
@@ -2681,7 +2601,7 @@
               <w:rPr>
                 <w:noProof/>
               </w:rPr>
-              <w:t>1</w:t>
+              <w:t>8</w:t>
             </w:r>
             <w:r>
               <w:rPr>
@@ -2710,51 +2630,7 @@
           <w:sz w:val="20"/>
           <w:szCs w:val="20"/>
         </w:rPr>
-        <w:t xml:space="preserve">Este índice se genera automáticamente a partir de los títulos del documento. En Word: clic derecho sobre él → "Actualizar campos" → "Actualizar toda la tabla" (o selecciona todo el documento con </w:t>
-      </w:r>
-      <w:proofErr w:type="spellStart"/>
-      <w:r>
-        <w:rPr>
-          <w:i/>
-          <w:iCs/>
-          <w:color w:val="595959"/>
-          <w:sz w:val="20"/>
-          <w:szCs w:val="20"/>
-        </w:rPr>
-        <w:t>Ctrl+A</w:t>
-      </w:r>
-      <w:proofErr w:type="spellEnd"/>
-      <w:r>
-        <w:rPr>
-          <w:i/>
-          <w:iCs/>
-          <w:color w:val="595959"/>
-          <w:sz w:val="20"/>
-          <w:szCs w:val="20"/>
-        </w:rPr>
-        <w:t xml:space="preserve"> y presiona F9) para que se recalculen los números de página. El control de versiones (tabla anterior) se complementa con el historial de </w:t>
-      </w:r>
-      <w:proofErr w:type="spellStart"/>
-      <w:r>
-        <w:rPr>
-          <w:i/>
-          <w:iCs/>
-          <w:color w:val="595959"/>
-          <w:sz w:val="20"/>
-          <w:szCs w:val="20"/>
-        </w:rPr>
-        <w:t>commits</w:t>
-      </w:r>
-      <w:proofErr w:type="spellEnd"/>
-      <w:r>
-        <w:rPr>
-          <w:i/>
-          <w:iCs/>
-          <w:color w:val="595959"/>
-          <w:sz w:val="20"/>
-          <w:szCs w:val="20"/>
-        </w:rPr>
-        <w:t xml:space="preserve"> del repositorio Git del proyecto, que registra la evidencia detallada de cada cambio técnico.</w:t>
+        <w:t>Este índice se genera automáticamente a partir de los títulos del documento. En Word: clic derecho sobre él → "Actualizar campos" → "Actualizar toda la tabla" (o selecciona todo el documento con Ctrl+A y presiona F9) para que se recalculen los números de página. El control de versiones (tabla anterior) se complementa con el historial de commits del repositorio Git del proyecto, que registra la evidencia detallada de cada cambio técnico.</w:t>
       </w:r>
     </w:p>
     <w:p>
@@ -2782,23 +2658,7 @@
         <w:spacing w:after="160" w:line="276" w:lineRule="auto"/>
       </w:pPr>
       <w:r>
-        <w:t xml:space="preserve">SkateClub es una aplicación social para la comunidad </w:t>
-      </w:r>
-      <w:proofErr w:type="spellStart"/>
-      <w:r>
-        <w:t>skater</w:t>
-      </w:r>
-      <w:proofErr w:type="spellEnd"/>
-      <w:r>
-        <w:t xml:space="preserve"> que reúne en una sola plataforma tres necesidades hoy dispersas: descubrir spots de calidad mediante un mapa colaborativo geolocalizado, conectar con otros patinadores a través de un </w:t>
-      </w:r>
-      <w:proofErr w:type="spellStart"/>
-      <w:r>
-        <w:t>feed</w:t>
-      </w:r>
-      <w:proofErr w:type="spellEnd"/>
-      <w:r>
-        <w:t xml:space="preserve"> social y mensajería directa, y competir de forma sana mediante duelos y un sistema de gamificación con puntos y recompensas.</w:t>
+        <w:t>SkateClub es una aplicación social para la comunidad skater que reúne en una sola plataforma tres necesidades hoy dispersas: descubrir spots de calidad mediante un mapa colaborativo geolocalizado, conectar con otros patinadores a través de un feed social y mensajería directa, y competir de forma sana mediante duelos y un sistema de gamificación con puntos y recompensas.</w:t>
       </w:r>
     </w:p>
     <w:p>
@@ -2806,15 +2666,7 @@
         <w:spacing w:after="160" w:line="276" w:lineRule="auto"/>
       </w:pPr>
       <w:r>
-        <w:t xml:space="preserve">El proyecto nace de la observación directa del equipo sobre la comunidad </w:t>
-      </w:r>
-      <w:proofErr w:type="spellStart"/>
-      <w:r>
-        <w:t>skater</w:t>
-      </w:r>
-      <w:proofErr w:type="spellEnd"/>
-      <w:r>
-        <w:t xml:space="preserve"> local, que hoy resuelve estas necesidades con herramientas genéricas y poco adecuadas: mapas sin curaduría específica para skate, grupos de WhatsApp o Instagram difíciles de buscar y sin estructura, y ausencia de espacios de reconocimiento o competencia formal entre pares. Esta observación es un supuesto de partida del equipo, pendiente de contraste sistemático con usuarios durante el desarrollo del piloto.</w:t>
+        <w:t>El proyecto nace de la observación directa del equipo sobre la comunidad skater local, que hoy resuelve estas necesidades con herramientas genéricas y poco adecuadas: mapas sin curaduría específica para skate, grupos de WhatsApp o Instagram difíciles de buscar y sin estructura, y ausencia de espacios de reconocimiento o competencia formal entre pares. Esta observación es un supuesto de partida del equipo, pendiente de contraste sistemático con usuarios durante el desarrollo del piloto.</w:t>
       </w:r>
     </w:p>
     <w:p>
@@ -2828,79 +2680,7 @@
         <w:t>iteria</w:t>
       </w:r>
       <w:r>
-        <w:t xml:space="preserve"> SYSTEMS bajo la marca de producto SkateClub (estudio interno GrindOps), el alcance que este documento formaliza para la evaluación de </w:t>
-      </w:r>
-      <w:proofErr w:type="spellStart"/>
-      <w:r>
-        <w:t>Capstone</w:t>
-      </w:r>
-      <w:proofErr w:type="spellEnd"/>
-      <w:r>
-        <w:t xml:space="preserve"> se enfoca en tres módulos: mapa colaborativo de spots, red social básica (perfil, </w:t>
-      </w:r>
-      <w:proofErr w:type="spellStart"/>
-      <w:r>
-        <w:t>feed</w:t>
-      </w:r>
-      <w:proofErr w:type="spellEnd"/>
-      <w:r>
-        <w:t xml:space="preserve"> y mensajería) y sistema de gamificación (duelos, puntaje y </w:t>
-      </w:r>
-      <w:proofErr w:type="spellStart"/>
-      <w:r>
-        <w:t>leaderboard</w:t>
-      </w:r>
-      <w:proofErr w:type="spellEnd"/>
-      <w:r>
-        <w:t xml:space="preserve">). La solución se construye sobre una arquitectura cliente-servidor —cliente en </w:t>
-      </w:r>
-      <w:proofErr w:type="spellStart"/>
-      <w:r>
-        <w:t>Flutter</w:t>
-      </w:r>
-      <w:proofErr w:type="spellEnd"/>
-      <w:r>
-        <w:t xml:space="preserve"> (móvil y web) que consume una API REST construida en </w:t>
-      </w:r>
-      <w:proofErr w:type="spellStart"/>
-      <w:r>
-        <w:t>FastAPI</w:t>
-      </w:r>
-      <w:proofErr w:type="spellEnd"/>
-      <w:r>
-        <w:t xml:space="preserve">, base de datos PostgreSQL con extensión </w:t>
-      </w:r>
-      <w:proofErr w:type="spellStart"/>
-      <w:r>
-        <w:t>PostGIS</w:t>
-      </w:r>
-      <w:proofErr w:type="spellEnd"/>
-      <w:r>
-        <w:t xml:space="preserve"> (geolocalización) y </w:t>
-      </w:r>
-      <w:proofErr w:type="spellStart"/>
-      <w:r>
-        <w:t>Supabase</w:t>
-      </w:r>
-      <w:proofErr w:type="spellEnd"/>
-      <w:r>
-        <w:t xml:space="preserve"> como servicio de almacenamiento de archivos—, con despliegue productivo en </w:t>
-      </w:r>
-      <w:proofErr w:type="spellStart"/>
-      <w:r>
-        <w:t>Vercel</w:t>
-      </w:r>
-      <w:proofErr w:type="spellEnd"/>
-      <w:r>
-        <w:t xml:space="preserve"> y Render como alternativa de despliegue </w:t>
-      </w:r>
-      <w:proofErr w:type="spellStart"/>
-      <w:r>
-        <w:t>containerizado</w:t>
-      </w:r>
-      <w:proofErr w:type="spellEnd"/>
-      <w:r>
-        <w:t xml:space="preserve"> con Docker.</w:t>
+        <w:t xml:space="preserve"> SYSTEMS bajo la marca de producto SkateClub (estudio interno GrindOps), el alcance que este documento formaliza para la evaluación de Capstone se enfoca en tres módulos: mapa colaborativo de spots, red social básica (perfil, feed y mensajería) y sistema de gamificación (duelos, puntaje y leaderboard). La solución se construye sobre una arquitectura cliente-servidor —cliente en Flutter (móvil y web) que consume una API REST construida en FastAPI, base de datos PostgreSQL con extensión PostGIS (geolocalización) y Supabase como servicio de almacenamiento de archivos—, con despliegue productivo en Vercel y Render como alternativa de despliegue containerizado con Docker.</w:t>
       </w:r>
     </w:p>
     <w:p>
@@ -2974,89 +2754,17 @@
         </w:rPr>
         <w:t xml:space="preserve">Built by </w:t>
       </w:r>
-      <w:proofErr w:type="spellStart"/>
       <w:r>
         <w:rPr>
           <w:lang w:val="en-US"/>
         </w:rPr>
         <w:t>iteria</w:t>
       </w:r>
-      <w:proofErr w:type="spellEnd"/>
       <w:r>
         <w:rPr>
           <w:lang w:val="en-US"/>
         </w:rPr>
-        <w:t xml:space="preserve"> SYSTEMS under the SkateClub product brand (internal studio </w:t>
-      </w:r>
-      <w:proofErr w:type="spellStart"/>
-      <w:r>
-        <w:rPr>
-          <w:lang w:val="en-US"/>
-        </w:rPr>
-        <w:t>GrindOps</w:t>
-      </w:r>
-      <w:proofErr w:type="spellEnd"/>
-      <w:r>
-        <w:rPr>
-          <w:lang w:val="en-US"/>
-        </w:rPr>
-        <w:t xml:space="preserve">), the scope formalized for Capstone evaluation focuses on three modules: a collaborative spot map, a basic social layer (profile, feed and messaging), and a gamification system (duels, points and leaderboard). The solution is built on a client-server architecture —a Flutter client (mobile and web) consuming a REST API built in </w:t>
-      </w:r>
-      <w:proofErr w:type="spellStart"/>
-      <w:r>
-        <w:rPr>
-          <w:lang w:val="en-US"/>
-        </w:rPr>
-        <w:t>FastAPI</w:t>
-      </w:r>
-      <w:proofErr w:type="spellEnd"/>
-      <w:r>
-        <w:rPr>
-          <w:lang w:val="en-US"/>
-        </w:rPr>
-        <w:t xml:space="preserve">, a PostgreSQL database with the </w:t>
-      </w:r>
-      <w:proofErr w:type="spellStart"/>
-      <w:r>
-        <w:rPr>
-          <w:lang w:val="en-US"/>
-        </w:rPr>
-        <w:t>PostGIS</w:t>
-      </w:r>
-      <w:proofErr w:type="spellEnd"/>
-      <w:r>
-        <w:rPr>
-          <w:lang w:val="en-US"/>
-        </w:rPr>
-        <w:t xml:space="preserve"> extension for geolocation, and </w:t>
-      </w:r>
-      <w:proofErr w:type="spellStart"/>
-      <w:r>
-        <w:rPr>
-          <w:lang w:val="en-US"/>
-        </w:rPr>
-        <w:t>Supabase</w:t>
-      </w:r>
-      <w:proofErr w:type="spellEnd"/>
-      <w:r>
-        <w:rPr>
-          <w:lang w:val="en-US"/>
-        </w:rPr>
-        <w:t xml:space="preserve"> as a file-storage service— with production deployment on </w:t>
-      </w:r>
-      <w:proofErr w:type="spellStart"/>
-      <w:r>
-        <w:rPr>
-          <w:lang w:val="en-US"/>
-        </w:rPr>
-        <w:t>Vercel</w:t>
-      </w:r>
-      <w:proofErr w:type="spellEnd"/>
-      <w:r>
-        <w:rPr>
-          <w:lang w:val="en-US"/>
-        </w:rPr>
-        <w:t xml:space="preserve"> and Render as a containerized deployment alternative using Docker.</w:t>
+        <w:t xml:space="preserve"> SYSTEMS under the SkateClub product brand (internal studio GrindOps), the scope formalized for Capstone evaluation focuses on three modules: a collaborative spot map, a basic social layer (profile, feed and messaging), and a gamification system (duels, points and leaderboard). The solution is built on a client-server architecture —a Flutter client (mobile and web) consuming a REST API built in FastAPI, a PostgreSQL database with the PostGIS extension for geolocation, and Supabase as a file-storage service— with production deployment on Vercel and Render as a containerized deployment alternative using Docker.</w:t>
       </w:r>
     </w:p>
     <w:p>
@@ -3115,23 +2823,7 @@
         <w:spacing w:after="160" w:line="276" w:lineRule="auto"/>
       </w:pPr>
       <w:r>
-        <w:t xml:space="preserve">La comunidad </w:t>
-      </w:r>
-      <w:proofErr w:type="spellStart"/>
-      <w:r>
-        <w:t>skater</w:t>
-      </w:r>
-      <w:proofErr w:type="spellEnd"/>
-      <w:r>
-        <w:t xml:space="preserve"> carece de una plataforma digital especializada que centralice el descubrimiento de spots, la interacción social y el reconocimiento competitivo. Hoy, la información sobre lugares para patinar —calidad del pavimento, nivel de dificultad, riesgo de fiscalización, fotos y videos— se dispersa de manera informal entre grupos de WhatsApp, publicaciones de Instagram y el boca a boca, sin un repositorio colaborativo, </w:t>
-      </w:r>
-      <w:proofErr w:type="spellStart"/>
-      <w:r>
-        <w:t>buscable</w:t>
-      </w:r>
-      <w:proofErr w:type="spellEnd"/>
-      <w:r>
-        <w:t xml:space="preserve"> y actualizado.</w:t>
+        <w:t>La comunidad skater carece de una plataforma digital especializada que centralice el descubrimiento de spots, la interacción social y el reconocimiento competitivo. Hoy, la información sobre lugares para patinar —calidad del pavimento, nivel de dificultad, riesgo de fiscalización, fotos y videos— se dispersa de manera informal entre grupos de WhatsApp, publicaciones de Instagram y el boca a boca, sin un repositorio colaborativo, buscable y actualizado.</w:t>
       </w:r>
     </w:p>
     <w:p>
@@ -3139,15 +2831,7 @@
         <w:spacing w:after="160" w:line="276" w:lineRule="auto"/>
       </w:pPr>
       <w:r>
-        <w:t xml:space="preserve">A esto se suma la ausencia de espacios digitales que fomenten la competencia sana y la gamificación dentro de la comunidad: no existe un sistema estructurado de retos, puntajes o reconocimiento entre patinadores que incentive la </w:t>
-      </w:r>
-      <w:proofErr w:type="gramStart"/>
-      <w:r>
-        <w:t>participación activa</w:t>
-      </w:r>
-      <w:proofErr w:type="gramEnd"/>
-      <w:r>
-        <w:t xml:space="preserve"> y la fidelización a una plataforma común.</w:t>
+        <w:t>A esto se suma la ausencia de espacios digitales que fomenten la competencia sana y la gamificación dentro de la comunidad: no existe un sistema estructurado de retos, puntajes o reconocimiento entre patinadores que incentive la participación activa y la fidelización a una plataforma común.</w:t>
       </w:r>
     </w:p>
     <w:p>
@@ -3173,15 +2857,7 @@
         <w:spacing w:after="90" w:line="276" w:lineRule="auto"/>
       </w:pPr>
       <w:r>
-        <w:t xml:space="preserve">Herramientas genéricas (Google </w:t>
-      </w:r>
-      <w:proofErr w:type="spellStart"/>
-      <w:r>
-        <w:t>Maps</w:t>
-      </w:r>
-      <w:proofErr w:type="spellEnd"/>
-      <w:r>
-        <w:t>, redes sociales) no diseñadas para las necesidades específicas del skate.</w:t>
+        <w:t>Herramientas genéricas (Google Maps, redes sociales) no diseñadas para las necesidades específicas del skate.</w:t>
       </w:r>
     </w:p>
     <w:p>
@@ -3233,15 +2909,7 @@
         <w:spacing w:after="160" w:line="276" w:lineRule="auto"/>
       </w:pPr>
       <w:r>
-        <w:t xml:space="preserve">El proyecto define dos segmentos de usuario y un </w:t>
-      </w:r>
-      <w:proofErr w:type="spellStart"/>
-      <w:r>
-        <w:t>stakeholder</w:t>
-      </w:r>
-      <w:proofErr w:type="spellEnd"/>
-      <w:r>
-        <w:t xml:space="preserve"> externo de interés futuro:</w:t>
+        <w:t>El proyecto define dos segmentos de usuario y un stakeholder externo de interés futuro:</w:t>
       </w:r>
     </w:p>
     <w:p>
@@ -3254,15 +2922,7 @@
         <w:spacing w:after="90" w:line="276" w:lineRule="auto"/>
       </w:pPr>
       <w:r>
-        <w:t xml:space="preserve">Segmento primario: </w:t>
-      </w:r>
-      <w:proofErr w:type="spellStart"/>
-      <w:r>
-        <w:t>skaters</w:t>
-      </w:r>
-      <w:proofErr w:type="spellEnd"/>
-      <w:r>
-        <w:t xml:space="preserve"> urbanos de 15 a 30 años, con alta actividad en redes sociales y uso intensivo de smartphone, inicialmente concentrados en la Región Metropolitana de Chile.</w:t>
+        <w:t>Segmento primario: skaters urbanos de 15 a 30 años, con alta actividad en redes sociales y uso intensivo de smartphone, inicialmente concentrados en la Región Metropolitana de Chile.</w:t>
       </w:r>
     </w:p>
     <w:p>
@@ -3287,13 +2947,8 @@
         </w:numPr>
         <w:spacing w:after="90" w:line="276" w:lineRule="auto"/>
       </w:pPr>
-      <w:proofErr w:type="spellStart"/>
-      <w:r>
-        <w:t>Stakeholder</w:t>
-      </w:r>
-      <w:proofErr w:type="spellEnd"/>
-      <w:r>
-        <w:t xml:space="preserve"> externo (post-MVP): tiendas y marcas de skate interesadas en visibilidad dentro de la comunidad.</w:t>
+      <w:r>
+        <w:t>Stakeholder externo (post-MVP): tiendas y marcas de skate interesadas en visibilidad dentro de la comunidad.</w:t>
       </w:r>
     </w:p>
     <w:p>
@@ -3314,15 +2969,7 @@
         <w:spacing w:after="90" w:line="276" w:lineRule="auto"/>
       </w:pPr>
       <w:r>
-        <w:t xml:space="preserve">Google </w:t>
-      </w:r>
-      <w:proofErr w:type="spellStart"/>
-      <w:r>
-        <w:t>Maps</w:t>
-      </w:r>
-      <w:proofErr w:type="spellEnd"/>
-      <w:r>
-        <w:t xml:space="preserve"> / mapas genéricos: no permiten calificar spots, adjuntar evidencia en video ni filtrar por nivel de dificultad.</w:t>
+        <w:t>Google Maps / mapas genéricos: no permiten calificar spots, adjuntar evidencia en video ni filtrar por nivel de dificultad.</w:t>
       </w:r>
     </w:p>
     <w:p>
@@ -3335,15 +2982,7 @@
         <w:spacing w:after="90" w:line="276" w:lineRule="auto"/>
       </w:pPr>
       <w:r>
-        <w:t xml:space="preserve">Grupos de Instagram y WhatsApp: la información se pierde con el tiempo, no es </w:t>
-      </w:r>
-      <w:proofErr w:type="spellStart"/>
-      <w:r>
-        <w:t>buscable</w:t>
-      </w:r>
-      <w:proofErr w:type="spellEnd"/>
-      <w:r>
-        <w:t xml:space="preserve"> y depende de la actividad manual de administradores.</w:t>
+        <w:t>Grupos de Instagram y WhatsApp: la información se pierde con el tiempo, no es buscable y depende de la actividad manual de administradores.</w:t>
       </w:r>
     </w:p>
     <w:p>
@@ -3408,15 +3047,7 @@
         <w:spacing w:after="90" w:line="276" w:lineRule="auto"/>
       </w:pPr>
       <w:r>
-        <w:t xml:space="preserve">Red social (perfil, </w:t>
-      </w:r>
-      <w:proofErr w:type="spellStart"/>
-      <w:r>
-        <w:t>feed</w:t>
-      </w:r>
-      <w:proofErr w:type="spellEnd"/>
-      <w:r>
-        <w:t>, mensajería) → resuelve la dificultad para conectar y comunicarse dentro de la comunidad fuera de canales informales.</w:t>
+        <w:t>Red social (perfil, feed, mensajería) → resuelve la dificultad para conectar y comunicarse dentro de la comunidad fuera de canales informales.</w:t>
       </w:r>
     </w:p>
     <w:p>
@@ -3430,15 +3061,7 @@
       </w:pPr>
       <w:r>
         <w:lastRenderedPageBreak/>
-        <w:t xml:space="preserve">Duelos y gamificación (puntos, </w:t>
-      </w:r>
-      <w:proofErr w:type="spellStart"/>
-      <w:r>
-        <w:t>leaderboard</w:t>
-      </w:r>
-      <w:proofErr w:type="spellEnd"/>
-      <w:r>
-        <w:t>, recompensas) → resuelve la ausencia de espacios de reconocimiento y competencia sana entre patinadores.</w:t>
+        <w:t>Duelos y gamificación (puntos, leaderboard, recompensas) → resuelve la ausencia de espacios de reconocimiento y competencia sana entre patinadores.</w:t>
       </w:r>
     </w:p>
     <w:p>
@@ -3490,15 +3113,7 @@
         <w:spacing w:after="160" w:line="276" w:lineRule="auto"/>
       </w:pPr>
       <w:r>
-        <w:t xml:space="preserve">Desarrollar y validar un producto mínimo viable (MVP) de una aplicación social para la comunidad </w:t>
-      </w:r>
-      <w:proofErr w:type="spellStart"/>
-      <w:r>
-        <w:t>skater</w:t>
-      </w:r>
-      <w:proofErr w:type="spellEnd"/>
-      <w:r>
-        <w:t>, que centralice el descubrimiento colaborativo de spots, la interacción social y la gamificación, iniciando su validación con una comunidad piloto en Chile.</w:t>
+        <w:t>Desarrollar y validar un producto mínimo viable (MVP) de una aplicación social para la comunidad skater, que centralice el descubrimiento colaborativo de spots, la interacción social y la gamificación, iniciando su validación con una comunidad piloto en Chile.</w:t>
       </w:r>
     </w:p>
     <w:p>
@@ -3542,15 +3157,7 @@
         <w:spacing w:after="90" w:line="276" w:lineRule="auto"/>
       </w:pPr>
       <w:r>
-        <w:t xml:space="preserve">Desarrollar la capa social base del producto: perfil de usuario, </w:t>
-      </w:r>
-      <w:proofErr w:type="spellStart"/>
-      <w:r>
-        <w:t>feed</w:t>
-      </w:r>
-      <w:proofErr w:type="spellEnd"/>
-      <w:r>
-        <w:t xml:space="preserve"> de publicaciones y mensajería directa.</w:t>
+        <w:t>Desarrollar la capa social base del producto: perfil de usuario, feed de publicaciones y mensajería directa.</w:t>
       </w:r>
     </w:p>
     <w:p>
@@ -3563,15 +3170,7 @@
         <w:spacing w:after="90" w:line="276" w:lineRule="auto"/>
       </w:pPr>
       <w:r>
-        <w:t>Implementar el sistema de gamificación: duelos entre usuarios, puntaje y tabla de posiciones (</w:t>
-      </w:r>
-      <w:proofErr w:type="spellStart"/>
-      <w:r>
-        <w:t>leaderboard</w:t>
-      </w:r>
-      <w:proofErr w:type="spellEnd"/>
-      <w:r>
-        <w:t>).</w:t>
+        <w:t>Implementar el sistema de gamificación: duelos entre usuarios, puntaje y tabla de posiciones (leaderboard).</w:t>
       </w:r>
     </w:p>
     <w:p>
@@ -3584,39 +3183,7 @@
         <w:spacing w:after="90" w:line="276" w:lineRule="auto"/>
       </w:pPr>
       <w:r>
-        <w:t xml:space="preserve">Formalizar la arquitectura cliente-servidor del producto (API REST en </w:t>
-      </w:r>
-      <w:proofErr w:type="spellStart"/>
-      <w:r>
-        <w:t>FastAPI</w:t>
-      </w:r>
-      <w:proofErr w:type="spellEnd"/>
-      <w:r>
-        <w:t>, base de datos PostgreSQL/</w:t>
-      </w:r>
-      <w:proofErr w:type="spellStart"/>
-      <w:r>
-        <w:t>PostGIS</w:t>
-      </w:r>
-      <w:proofErr w:type="spellEnd"/>
-      <w:r>
-        <w:t xml:space="preserve">) y su despliegue en infraestructura </w:t>
-      </w:r>
-      <w:proofErr w:type="spellStart"/>
-      <w:r>
-        <w:t>cloud</w:t>
-      </w:r>
-      <w:proofErr w:type="spellEnd"/>
-      <w:r>
-        <w:t xml:space="preserve"> (</w:t>
-      </w:r>
-      <w:proofErr w:type="spellStart"/>
-      <w:r>
-        <w:t>Vercel</w:t>
-      </w:r>
-      <w:proofErr w:type="spellEnd"/>
-      <w:r>
-        <w:t xml:space="preserve"> en producción, Render como alternativa).</w:t>
+        <w:t>Formalizar la arquitectura cliente-servidor del producto (API REST en FastAPI, base de datos PostgreSQL/PostGIS) y su despliegue en infraestructura cloud (Vercel en producción, Render como alternativa).</w:t>
       </w:r>
     </w:p>
     <w:p>
@@ -3646,29 +3213,7 @@
           <w:sz w:val="24"/>
           <w:szCs w:val="24"/>
         </w:rPr>
-        <w:t>4.3 Métricas de éxito (</w:t>
-      </w:r>
-      <w:proofErr w:type="spellStart"/>
-      <w:r>
-        <w:rPr>
-          <w:b/>
-          <w:bCs/>
-          <w:color w:val="1F3864"/>
-          <w:sz w:val="24"/>
-          <w:szCs w:val="24"/>
-        </w:rPr>
-        <w:t>KPIs</w:t>
-      </w:r>
-      <w:proofErr w:type="spellEnd"/>
-      <w:r>
-        <w:rPr>
-          <w:b/>
-          <w:bCs/>
-          <w:color w:val="1F3864"/>
-          <w:sz w:val="24"/>
-          <w:szCs w:val="24"/>
-        </w:rPr>
-        <w:t>)</w:t>
+        <w:t>4.3 Métricas de éxito (KPIs)</w:t>
       </w:r>
       <w:bookmarkEnd w:id="12"/>
     </w:p>
@@ -3942,23 +3487,7 @@
                 <w:sz w:val="20"/>
                 <w:szCs w:val="20"/>
               </w:rPr>
-              <w:t xml:space="preserve">Conteo directo en la tabla spots (creados por usuarios, no por </w:t>
-            </w:r>
-            <w:proofErr w:type="spellStart"/>
-            <w:r>
-              <w:rPr>
-                <w:sz w:val="20"/>
-                <w:szCs w:val="20"/>
-              </w:rPr>
-              <w:t>seed</w:t>
-            </w:r>
-            <w:proofErr w:type="spellEnd"/>
-            <w:r>
-              <w:rPr>
-                <w:sz w:val="20"/>
-                <w:szCs w:val="20"/>
-              </w:rPr>
-              <w:t xml:space="preserve"> de datos).</w:t>
+              <w:t>Conteo directo en la tabla spots (creados por usuarios, no por seed de datos).</w:t>
             </w:r>
           </w:p>
         </w:tc>
@@ -4130,39 +3659,7 @@
                 <w:sz w:val="20"/>
                 <w:szCs w:val="20"/>
               </w:rPr>
-              <w:t xml:space="preserve">Medición con herramientas de </w:t>
-            </w:r>
-            <w:proofErr w:type="spellStart"/>
-            <w:r>
-              <w:rPr>
-                <w:sz w:val="20"/>
-                <w:szCs w:val="20"/>
-              </w:rPr>
-              <w:t>profiling</w:t>
-            </w:r>
-            <w:proofErr w:type="spellEnd"/>
-            <w:r>
-              <w:rPr>
-                <w:sz w:val="20"/>
-                <w:szCs w:val="20"/>
-              </w:rPr>
-              <w:t>/</w:t>
-            </w:r>
-            <w:proofErr w:type="spellStart"/>
-            <w:r>
-              <w:rPr>
-                <w:sz w:val="20"/>
-                <w:szCs w:val="20"/>
-              </w:rPr>
-              <w:t>DevTools</w:t>
-            </w:r>
-            <w:proofErr w:type="spellEnd"/>
-            <w:r>
-              <w:rPr>
-                <w:sz w:val="20"/>
-                <w:szCs w:val="20"/>
-              </w:rPr>
-              <w:t xml:space="preserve"> sobre conexión 4G simulada.</w:t>
+              <w:t>Medición con herramientas de profiling/DevTools sobre conexión 4G simulada.</w:t>
             </w:r>
           </w:p>
         </w:tc>
@@ -4212,18 +3709,8 @@
                 <w:szCs w:val="20"/>
                 <w:lang w:val="en-US"/>
               </w:rPr>
-              <w:t xml:space="preserve">Net Promoter Score (NPS) del </w:t>
-            </w:r>
-            <w:proofErr w:type="spellStart"/>
-            <w:r>
-              <w:rPr>
-                <w:sz w:val="20"/>
-                <w:szCs w:val="20"/>
-                <w:lang w:val="en-US"/>
-              </w:rPr>
-              <w:t>piloto</w:t>
-            </w:r>
-            <w:proofErr w:type="spellEnd"/>
+              <w:t>Net Promoter Score (NPS) del piloto</w:t>
+            </w:r>
           </w:p>
         </w:tc>
         <w:tc>
@@ -4306,21 +3793,9 @@
           <w:szCs w:val="28"/>
         </w:rPr>
         <w:lastRenderedPageBreak/>
-        <w:t xml:space="preserve">5. Usuarios y </w:t>
-      </w:r>
-      <w:proofErr w:type="spellStart"/>
-      <w:r>
-        <w:rPr>
-          <w:b/>
-          <w:bCs/>
-          <w:color w:val="1F3864"/>
-          <w:sz w:val="28"/>
-          <w:szCs w:val="28"/>
-        </w:rPr>
-        <w:t>Stakeholders</w:t>
+        <w:t>5. Usuarios y Stakeholders</w:t>
       </w:r>
       <w:bookmarkEnd w:id="13"/>
-      <w:proofErr w:type="spellEnd"/>
     </w:p>
     <w:p>
       <w:pPr>
@@ -4331,21 +3806,8 @@
         </w:numPr>
         <w:spacing w:after="90" w:line="276" w:lineRule="auto"/>
       </w:pPr>
-      <w:proofErr w:type="spellStart"/>
-      <w:r>
-        <w:t>Skater</w:t>
-      </w:r>
-      <w:proofErr w:type="spellEnd"/>
-      <w:r>
-        <w:t xml:space="preserve"> registrado (usuario principal): crea perfil, reporta y califica spots, participa en el </w:t>
-      </w:r>
-      <w:proofErr w:type="spellStart"/>
-      <w:r>
-        <w:t>feed</w:t>
-      </w:r>
-      <w:proofErr w:type="spellEnd"/>
-      <w:r>
-        <w:t>, mensajería y duelos.</w:t>
+      <w:r>
+        <w:t>Skater registrado (usuario principal): crea perfil, reporta y califica spots, participa en el feed, mensajería y duelos.</w:t>
       </w:r>
     </w:p>
     <w:p>
@@ -4390,15 +3852,7 @@
         <w:spacing w:after="90" w:line="276" w:lineRule="auto"/>
       </w:pPr>
       <w:r>
-        <w:t xml:space="preserve">Docente(s) y comisión evaluadora CAPSTONE: </w:t>
-      </w:r>
-      <w:proofErr w:type="spellStart"/>
-      <w:r>
-        <w:t>stakeholders</w:t>
-      </w:r>
-      <w:proofErr w:type="spellEnd"/>
-      <w:r>
-        <w:t xml:space="preserve"> académicos que evalúan el cumplimiento de objetivos, metodología y calidad del proyecto en cada fase.</w:t>
+        <w:t>Docente(s) y comisión evaluadora CAPSTONE: stakeholders académicos que evalúan el cumplimiento de objetivos, metodología y calidad del proyecto en cada fase.</w:t>
       </w:r>
     </w:p>
     <w:p>
@@ -4411,15 +3865,7 @@
         <w:spacing w:after="90" w:line="276" w:lineRule="auto"/>
       </w:pPr>
       <w:r>
-        <w:t>Marcas y tiendas de skate (</w:t>
-      </w:r>
-      <w:proofErr w:type="spellStart"/>
-      <w:r>
-        <w:t>stakeholder</w:t>
-      </w:r>
-      <w:proofErr w:type="spellEnd"/>
-      <w:r>
-        <w:t xml:space="preserve"> futuro): interesadas en patrocinios, eventos y visibilidad dentro de la comunidad, fuera del alcance del MVP actual.</w:t>
+        <w:t>Marcas y tiendas de skate (stakeholder futuro): interesadas en patrocinios, eventos y visibilidad dentro de la comunidad, fuera del alcance del MVP actual.</w:t>
       </w:r>
     </w:p>
     <w:p>
@@ -4445,15 +3891,7 @@
         <w:spacing w:after="160" w:line="276" w:lineRule="auto"/>
       </w:pPr>
       <w:r>
-        <w:t xml:space="preserve">SkateClub ya opera en producción con usuarios reales y su alcance actual es mayor que lo que este documento evalúa formalmente en </w:t>
-      </w:r>
-      <w:proofErr w:type="spellStart"/>
-      <w:r>
-        <w:t>Capstone</w:t>
-      </w:r>
-      <w:proofErr w:type="spellEnd"/>
-      <w:r>
-        <w:t>. Por eso el alcance se declara en tres niveles, evitando la ambigüedad de tratarlo como un MVP único:</w:t>
+        <w:t>SkateClub ya opera en producción con usuarios reales y su alcance actual es mayor que lo que este documento evalúa formalmente en Capstone. Por eso el alcance se declara en tres niveles, evitando la ambigüedad de tratarlo como un MVP único:</w:t>
       </w:r>
     </w:p>
     <w:p>
@@ -4470,29 +3908,7 @@
           <w:sz w:val="24"/>
           <w:szCs w:val="24"/>
         </w:rPr>
-        <w:t xml:space="preserve">6.1 MVP académico (foco de evaluación de </w:t>
-      </w:r>
-      <w:proofErr w:type="spellStart"/>
-      <w:r>
-        <w:rPr>
-          <w:b/>
-          <w:bCs/>
-          <w:color w:val="1F3864"/>
-          <w:sz w:val="24"/>
-          <w:szCs w:val="24"/>
-        </w:rPr>
-        <w:t>Capstone</w:t>
-      </w:r>
-      <w:proofErr w:type="spellEnd"/>
-      <w:r>
-        <w:rPr>
-          <w:b/>
-          <w:bCs/>
-          <w:color w:val="1F3864"/>
-          <w:sz w:val="24"/>
-          <w:szCs w:val="24"/>
-        </w:rPr>
-        <w:t>)</w:t>
+        <w:t>6.1 MVP académico (foco de evaluación de Capstone)</w:t>
       </w:r>
       <w:bookmarkEnd w:id="15"/>
     </w:p>
@@ -4539,13 +3955,8 @@
         </w:numPr>
         <w:spacing w:after="90" w:line="276" w:lineRule="auto"/>
       </w:pPr>
-      <w:proofErr w:type="spellStart"/>
-      <w:r>
-        <w:t>Feed</w:t>
-      </w:r>
-      <w:proofErr w:type="spellEnd"/>
-      <w:r>
-        <w:t xml:space="preserve"> social básico y mensajería directa entre usuarios.</w:t>
+      <w:r>
+        <w:t>Feed social básico y mensajería directa entre usuarios.</w:t>
       </w:r>
     </w:p>
     <w:p>
@@ -4558,15 +3969,7 @@
         <w:spacing w:after="90" w:line="276" w:lineRule="auto"/>
       </w:pPr>
       <w:r>
-        <w:t xml:space="preserve">Sistema de duelos S.K.A.T.E., puntaje y </w:t>
-      </w:r>
-      <w:proofErr w:type="spellStart"/>
-      <w:r>
-        <w:t>leaderboard</w:t>
-      </w:r>
-      <w:proofErr w:type="spellEnd"/>
-      <w:r>
-        <w:t xml:space="preserve"> (gamificación).</w:t>
+        <w:t>Sistema de duelos S.K.A.T.E., puntaje y leaderboard (gamificación).</w:t>
       </w:r>
     </w:p>
     <w:p>
@@ -4592,15 +3995,7 @@
         <w:spacing w:after="160" w:line="276" w:lineRule="auto"/>
       </w:pPr>
       <w:r>
-        <w:t xml:space="preserve">Funcionalidades que ya forman parte del producto real, no evaluadas en profundidad este </w:t>
-      </w:r>
-      <w:proofErr w:type="gramStart"/>
-      <w:r>
-        <w:t>semestre</w:t>
-      </w:r>
-      <w:proofErr w:type="gramEnd"/>
-      <w:r>
-        <w:t xml:space="preserve"> pero presentes en el sistema:</w:t>
+        <w:t>Funcionalidades que ya forman parte del producto real, no evaluadas en profundidad este semestre pero presentes en el sistema:</w:t>
       </w:r>
     </w:p>
     <w:p>
@@ -4626,15 +4021,7 @@
         <w:spacing w:after="90" w:line="276" w:lineRule="auto"/>
       </w:pPr>
       <w:r>
-        <w:t xml:space="preserve">Minijuego de puntos con sesiones </w:t>
-      </w:r>
-      <w:proofErr w:type="spellStart"/>
-      <w:r>
-        <w:t>anti-trampa</w:t>
-      </w:r>
-      <w:proofErr w:type="spellEnd"/>
-      <w:r>
-        <w:t>.</w:t>
+        <w:t>Minijuego de puntos con sesiones anti-trampa.</w:t>
       </w:r>
     </w:p>
     <w:p>
@@ -4730,15 +4117,7 @@
         <w:spacing w:after="90" w:line="276" w:lineRule="auto"/>
       </w:pPr>
       <w:r>
-        <w:t>Publicación oficial en Apple App Store (</w:t>
-      </w:r>
-      <w:proofErr w:type="spellStart"/>
-      <w:r>
-        <w:t>Flutter</w:t>
-      </w:r>
-      <w:proofErr w:type="spellEnd"/>
-      <w:r>
-        <w:t xml:space="preserve"> ya soporta iOS; lo que queda fuera es el proceso de publicación y certificación en la tienda de Apple).</w:t>
+        <w:t>Publicación oficial en Apple App Store (Flutter ya soporta iOS; lo que queda fuera es el proceso de publicación y certificación en la tienda de Apple).</w:t>
       </w:r>
     </w:p>
     <w:p>
@@ -4809,31 +4188,7 @@
         <w:spacing w:after="90" w:line="276" w:lineRule="auto"/>
       </w:pPr>
       <w:r>
-        <w:t>Presupuesto: proyecto autofinanciado por el equipo, utilizando exclusivamente planes gratuitos de infraestructura (</w:t>
-      </w:r>
-      <w:proofErr w:type="spellStart"/>
-      <w:r>
-        <w:t>Vercel</w:t>
-      </w:r>
-      <w:proofErr w:type="spellEnd"/>
-      <w:r>
-        <w:t xml:space="preserve">, Render y </w:t>
-      </w:r>
-      <w:proofErr w:type="spellStart"/>
-      <w:r>
-        <w:t>Supabase</w:t>
-      </w:r>
-      <w:proofErr w:type="spellEnd"/>
-      <w:r>
-        <w:t xml:space="preserve"> en sus </w:t>
-      </w:r>
-      <w:proofErr w:type="spellStart"/>
-      <w:r>
-        <w:t>tiers</w:t>
-      </w:r>
-      <w:proofErr w:type="spellEnd"/>
-      <w:r>
-        <w:t xml:space="preserve"> sin costo).</w:t>
+        <w:t>Presupuesto: proyecto autofinanciado por el equipo, utilizando exclusivamente planes gratuitos de infraestructura (Vercel, Render y Supabase en sus tiers sin costo).</w:t>
       </w:r>
     </w:p>
     <w:p>
@@ -4846,39 +4201,7 @@
         <w:spacing w:after="90" w:line="276" w:lineRule="auto"/>
       </w:pPr>
       <w:r>
-        <w:t xml:space="preserve">Tecnológicas: </w:t>
-      </w:r>
-      <w:proofErr w:type="spellStart"/>
-      <w:r>
-        <w:t>stack</w:t>
-      </w:r>
-      <w:proofErr w:type="spellEnd"/>
-      <w:r>
-        <w:t xml:space="preserve"> definido —</w:t>
-      </w:r>
-      <w:proofErr w:type="spellStart"/>
-      <w:r>
-        <w:t>Flutter</w:t>
-      </w:r>
-      <w:proofErr w:type="spellEnd"/>
-      <w:r>
-        <w:t xml:space="preserve">, </w:t>
-      </w:r>
-      <w:proofErr w:type="spellStart"/>
-      <w:r>
-        <w:t>FastAPI</w:t>
-      </w:r>
-      <w:proofErr w:type="spellEnd"/>
-      <w:r>
-        <w:t xml:space="preserve"> (arquitectura cliente-servidor, en migración desde un monolito hacia módulos por dominio), PostgreSQL/</w:t>
-      </w:r>
-      <w:proofErr w:type="spellStart"/>
-      <w:r>
-        <w:t>PostGIS</w:t>
-      </w:r>
-      <w:proofErr w:type="spellEnd"/>
-      <w:r>
-        <w:t>, Docker— con evidencia de desarrollo disponible en un repositorio Git público durante todo el semestre.</w:t>
+        <w:t>Tecnológicas: stack definido —Flutter, FastAPI (arquitectura cliente-servidor, en migración desde un monolito hacia módulos por dominio), PostgreSQL/PostGIS, Docker— con evidencia de desarrollo disponible en un repositorio Git público durante todo el semestre.</w:t>
       </w:r>
     </w:p>
     <w:p>
@@ -4891,7 +4214,13 @@
         <w:spacing w:after="90" w:line="276" w:lineRule="auto"/>
       </w:pPr>
       <w:r>
-        <w:t>Alcance geográfico: piloto limitado a la Región Metropolitana de Chile durante la vigencia del proyecto académico.</w:t>
+        <w:t xml:space="preserve">Alcance geográfico: piloto limitado </w:t>
+      </w:r>
+      <w:r>
+        <w:t xml:space="preserve">al territorio nacional que comprende </w:t>
+      </w:r>
+      <w:r>
+        <w:t>Chile durante la vigencia del proyecto académico.</w:t>
       </w:r>
     </w:p>
     <w:p>
@@ -4904,15 +4233,7 @@
         <w:spacing w:after="90" w:line="276" w:lineRule="auto"/>
       </w:pPr>
       <w:r>
-        <w:t xml:space="preserve">Datos y privacidad: el tratamiento de datos de geolocalización y perfiles de usuario debe ajustarse a buenas prácticas de privacidad y minimización de datos, dado el carácter público de parte de la información (spots, </w:t>
-      </w:r>
-      <w:proofErr w:type="spellStart"/>
-      <w:r>
-        <w:t>feed</w:t>
-      </w:r>
-      <w:proofErr w:type="spellEnd"/>
-      <w:r>
-        <w:t>).</w:t>
+        <w:t>Datos y privacidad: el tratamiento de datos de geolocalización y perfiles de usuario debe ajustarse a buenas prácticas de privacidad y minimización de datos, dado el carácter público de parte de la información (spots, feed).</w:t>
       </w:r>
     </w:p>
     <w:p>
@@ -4957,15 +4278,7 @@
         <w:spacing w:after="90" w:line="276" w:lineRule="auto"/>
       </w:pPr>
       <w:r>
-        <w:t xml:space="preserve">Propuesta de valor: plataforma todo-en-uno para descubrir spots, socializar y competir dentro de la comunidad </w:t>
-      </w:r>
-      <w:proofErr w:type="spellStart"/>
-      <w:r>
-        <w:t>skater</w:t>
-      </w:r>
-      <w:proofErr w:type="spellEnd"/>
-      <w:r>
-        <w:t>.</w:t>
+        <w:t>Propuesta de valor: plataforma todo-en-uno para descubrir spots, socializar y competir dentro de la comunidad skater.</w:t>
       </w:r>
     </w:p>
     <w:p>
@@ -5004,15 +4317,7 @@
         <w:spacing w:after="90" w:line="276" w:lineRule="auto"/>
       </w:pPr>
       <w:r>
-        <w:t xml:space="preserve">Fuentes de ingreso futuras (post-MVP): modelo </w:t>
-      </w:r>
-      <w:proofErr w:type="spellStart"/>
-      <w:r>
-        <w:t>freemium</w:t>
-      </w:r>
-      <w:proofErr w:type="spellEnd"/>
-      <w:r>
-        <w:t xml:space="preserve"> con funcionalidades premium, alianzas con marcas y patrocinio de eventos o duelos.</w:t>
+        <w:t>Fuentes de ingreso futuras (post-MVP): modelo freemium con funcionalidades premium, alianzas con marcas y patrocinio de eventos o duelos.</w:t>
       </w:r>
     </w:p>
     <w:p>
@@ -5025,15 +4330,7 @@
         <w:spacing w:after="90" w:line="276" w:lineRule="auto"/>
       </w:pPr>
       <w:r>
-        <w:t xml:space="preserve">Actividades y recursos clave: desarrollo y mantenimiento de producto, gestión de comunidad y curaduría de contenido, e infraestructura </w:t>
-      </w:r>
-      <w:proofErr w:type="spellStart"/>
-      <w:r>
-        <w:t>cloud</w:t>
-      </w:r>
-      <w:proofErr w:type="spellEnd"/>
-      <w:r>
-        <w:t xml:space="preserve"> del estudio GrindOps.</w:t>
+        <w:t>Actividades y recursos clave: desarrollo y mantenimiento de producto, gestión de comunidad y curaduría de contenido, e infraestructura cloud del estudio GrindOps.</w:t>
       </w:r>
     </w:p>
     <w:p>
@@ -5210,33 +4507,8 @@
                 <w:sz w:val="20"/>
                 <w:szCs w:val="20"/>
               </w:rPr>
-              <w:t xml:space="preserve">Tech Lead &amp; </w:t>
-            </w:r>
-            <w:proofErr w:type="spellStart"/>
-            <w:r>
-              <w:rPr>
-                <w:sz w:val="20"/>
-                <w:szCs w:val="20"/>
-              </w:rPr>
-              <w:t>Backend</w:t>
-            </w:r>
-            <w:proofErr w:type="spellEnd"/>
-            <w:r>
-              <w:rPr>
-                <w:sz w:val="20"/>
-                <w:szCs w:val="20"/>
-              </w:rPr>
-              <w:t xml:space="preserve"> </w:t>
-            </w:r>
-            <w:proofErr w:type="spellStart"/>
-            <w:r>
-              <w:rPr>
-                <w:sz w:val="20"/>
-                <w:szCs w:val="20"/>
-              </w:rPr>
-              <w:t>Developer</w:t>
-            </w:r>
-            <w:proofErr w:type="spellEnd"/>
+              <w:t>Tech Lead &amp; Backend Developer</w:t>
+            </w:r>
           </w:p>
         </w:tc>
         <w:tc>
@@ -5256,39 +4528,7 @@
                 <w:sz w:val="20"/>
                 <w:szCs w:val="20"/>
               </w:rPr>
-              <w:t>Arquitectura cliente-servidor, modelado de base de datos (PostgreSQL/</w:t>
-            </w:r>
-            <w:proofErr w:type="spellStart"/>
-            <w:r>
-              <w:rPr>
-                <w:sz w:val="20"/>
-                <w:szCs w:val="20"/>
-              </w:rPr>
-              <w:t>PostGIS</w:t>
-            </w:r>
-            <w:proofErr w:type="spellEnd"/>
-            <w:r>
-              <w:rPr>
-                <w:sz w:val="20"/>
-                <w:szCs w:val="20"/>
-              </w:rPr>
-              <w:t xml:space="preserve">), API en </w:t>
-            </w:r>
-            <w:proofErr w:type="spellStart"/>
-            <w:r>
-              <w:rPr>
-                <w:sz w:val="20"/>
-                <w:szCs w:val="20"/>
-              </w:rPr>
-              <w:t>FastAPI</w:t>
-            </w:r>
-            <w:proofErr w:type="spellEnd"/>
-            <w:r>
-              <w:rPr>
-                <w:sz w:val="20"/>
-                <w:szCs w:val="20"/>
-              </w:rPr>
-              <w:t>, seguridad y control de calidad técnica.</w:t>
+              <w:t>Arquitectura cliente-servidor, modelado de base de datos (PostgreSQL/PostGIS), API en FastAPI, seguridad y control de calidad técnica.</w:t>
             </w:r>
           </w:p>
         </w:tc>
@@ -5327,47 +4567,13 @@
             <w:vAlign w:val="center"/>
           </w:tcPr>
           <w:p>
-            <w:proofErr w:type="spellStart"/>
-            <w:r>
-              <w:rPr>
-                <w:sz w:val="20"/>
-                <w:szCs w:val="20"/>
-              </w:rPr>
-              <w:t>Product</w:t>
-            </w:r>
-            <w:proofErr w:type="spellEnd"/>
-            <w:r>
-              <w:rPr>
-                <w:sz w:val="20"/>
-                <w:szCs w:val="20"/>
-              </w:rPr>
-              <w:t xml:space="preserve"> Owner &amp; </w:t>
-            </w:r>
-            <w:proofErr w:type="spellStart"/>
-            <w:r>
-              <w:rPr>
-                <w:sz w:val="20"/>
-                <w:szCs w:val="20"/>
-              </w:rPr>
-              <w:t>Frontend</w:t>
-            </w:r>
-            <w:proofErr w:type="spellEnd"/>
-            <w:r>
-              <w:rPr>
-                <w:sz w:val="20"/>
-                <w:szCs w:val="20"/>
-              </w:rPr>
-              <w:t xml:space="preserve"> </w:t>
-            </w:r>
-            <w:proofErr w:type="spellStart"/>
-            <w:r>
-              <w:rPr>
-                <w:sz w:val="20"/>
-                <w:szCs w:val="20"/>
-              </w:rPr>
-              <w:t>Developer</w:t>
-            </w:r>
-            <w:proofErr w:type="spellEnd"/>
+            <w:r>
+              <w:rPr>
+                <w:sz w:val="20"/>
+                <w:szCs w:val="20"/>
+              </w:rPr>
+              <w:t>Product Owner &amp; Frontend Developer</w:t>
+            </w:r>
           </w:p>
         </w:tc>
         <w:tc>
@@ -5387,23 +4593,7 @@
                 <w:sz w:val="20"/>
                 <w:szCs w:val="20"/>
               </w:rPr>
-              <w:t xml:space="preserve">Visión de producto, priorización de backlog, experiencia de usuario y desarrollo del cliente en </w:t>
-            </w:r>
-            <w:proofErr w:type="spellStart"/>
-            <w:r>
-              <w:rPr>
-                <w:sz w:val="20"/>
-                <w:szCs w:val="20"/>
-              </w:rPr>
-              <w:t>Flutter</w:t>
-            </w:r>
-            <w:proofErr w:type="spellEnd"/>
-            <w:r>
-              <w:rPr>
-                <w:sz w:val="20"/>
-                <w:szCs w:val="20"/>
-              </w:rPr>
-              <w:t xml:space="preserve"> (móvil y web).</w:t>
+              <w:t>Visión de producto, priorización de backlog, experiencia de usuario y desarrollo del cliente en Flutter (móvil y web).</w:t>
             </w:r>
           </w:p>
         </w:tc>
@@ -5419,47 +4609,7 @@
         <w:spacing w:after="160" w:line="276" w:lineRule="auto"/>
       </w:pPr>
       <w:r>
-        <w:t xml:space="preserve">El equipo trabaja bajo metodología Scrum, con </w:t>
-      </w:r>
-      <w:proofErr w:type="spellStart"/>
-      <w:r>
-        <w:t>sprints</w:t>
-      </w:r>
-      <w:proofErr w:type="spellEnd"/>
-      <w:r>
-        <w:t xml:space="preserve"> alineados a las fechas de evaluación de la asignatura CAPSTONE, tablero de seguimiento en Jira (</w:t>
-      </w:r>
-      <w:proofErr w:type="spellStart"/>
-      <w:r>
-        <w:t>Product</w:t>
-      </w:r>
-      <w:proofErr w:type="spellEnd"/>
-      <w:r>
-        <w:t xml:space="preserve"> Backlog, Sprint Backlog y </w:t>
-      </w:r>
-      <w:proofErr w:type="spellStart"/>
-      <w:r>
-        <w:t>Definition</w:t>
-      </w:r>
-      <w:proofErr w:type="spellEnd"/>
-      <w:r>
-        <w:t xml:space="preserve"> </w:t>
-      </w:r>
-      <w:proofErr w:type="spellStart"/>
-      <w:r>
-        <w:t>of</w:t>
-      </w:r>
-      <w:proofErr w:type="spellEnd"/>
-      <w:r>
-        <w:t xml:space="preserve"> Done) y repositorio Git público como fuente única de evidencia técnica del proyecto, conforme a los requisitos del instructivo </w:t>
-      </w:r>
-      <w:proofErr w:type="spellStart"/>
-      <w:r>
-        <w:t>Capstone</w:t>
-      </w:r>
-      <w:proofErr w:type="spellEnd"/>
-      <w:r>
-        <w:t xml:space="preserve"> 2026.</w:t>
+        <w:t>El equipo trabaja bajo metodología Scrum, con sprints alineados a las fechas de evaluación de la asignatura CAPSTONE, tablero de seguimiento en Jira (Product Backlog, Sprint Backlog y Definition of Done) y repositorio Git público como fuente única de evidencia técnica del proyecto, conforme a los requisitos del instructivo Capstone 2026.</w:t>
       </w:r>
     </w:p>
     <w:sectPr>

</xml_diff>